<commit_message>
feat: add I.1 & I.2
</commit_message>
<xml_diff>
--- a/FOS_RDS_v1.0.docx
+++ b/FOS_RDS_v1.0.docx
@@ -215,12 +215,6 @@
         <w:gridCol w:w="4626"/>
       </w:tblGrid>
       <w:tr>
-        <w:tblPrEx>
-          <w:tblCellMar>
-            <w:top w:w="0" w:type="dxa"/>
-            <w:bottom w:w="0" w:type="dxa"/>
-          </w:tblCellMar>
-        </w:tblPrEx>
         <w:tc>
           <w:tcPr>
             <w:tcW w:w="1200" w:type="dxa"/>
@@ -343,12 +337,6 @@
         </w:tc>
       </w:tr>
       <w:tr>
-        <w:tblPrEx>
-          <w:tblCellMar>
-            <w:top w:w="0" w:type="dxa"/>
-            <w:bottom w:w="0" w:type="dxa"/>
-          </w:tblCellMar>
-        </w:tblPrEx>
         <w:tc>
           <w:tcPr>
             <w:tcW w:w="1200" w:type="dxa"/>
@@ -615,193 +603,640 @@
       </w:r>
     </w:p>
     <w:p>
-      <w:pPr>
-        <w:pStyle w:val="ListParagraph"/>
-        <w:numPr>
-          <w:ilvl w:val="0"/>
-          <w:numId w:val="3"/>
-        </w:numPr>
-      </w:pPr>
-      <w:r>
-        <w:t>F01: Viewing products – View product list by category, new products, Best Sellers, Sale Products; Search Products by Name; View Product Detail.</w:t>
+      <w:r>
+        <w:t>F01: Authentication &amp; Profile Management</w:t>
+      </w:r>
+      <w:r>
+        <w:br/>
+        <w:t>• Register Account</w:t>
+      </w:r>
+      <w:r>
+        <w:br/>
+        <w:t>• Login/Logout</w:t>
+      </w:r>
+      <w:r>
+        <w:br/>
+        <w:t>• Forgot Password</w:t>
+      </w:r>
+      <w:r>
+        <w:br/>
+        <w:t>• Login with Google/Facebook</w:t>
+      </w:r>
+      <w:r>
+        <w:br/>
+        <w:t>• View Profile</w:t>
+      </w:r>
+      <w:r>
+        <w:br/>
+        <w:t>• Update Personal Information</w:t>
+      </w:r>
+      <w:r>
+        <w:br/>
+        <w:t>• Change Password</w:t>
+      </w:r>
+      <w:r>
+        <w:br/>
+      </w:r>
+      <w:r>
+        <w:br/>
+        <w:t>F02: Court Search &amp; Discovery</w:t>
+      </w:r>
+      <w:r>
+        <w:br/>
+        <w:t>• Search Courts by Name</w:t>
+      </w:r>
+      <w:r>
+        <w:br/>
+        <w:t>• Search Courts by Location</w:t>
+      </w:r>
+      <w:r>
+        <w:br/>
+      </w:r>
+      <w:r>
+        <w:lastRenderedPageBreak/>
+        <w:t>• Filter Courts by Sport Type</w:t>
+      </w:r>
+      <w:r>
+        <w:br/>
+        <w:t>• Filter Courts by Price</w:t>
+      </w:r>
+      <w:r>
+        <w:br/>
+        <w:t>• View Court Details</w:t>
+      </w:r>
+      <w:r>
+        <w:br/>
+        <w:t>• View Court Images</w:t>
+      </w:r>
+      <w:r>
+        <w:br/>
+        <w:t>• View Court Availability</w:t>
+      </w:r>
+      <w:r>
+        <w:br/>
+      </w:r>
+      <w:r>
+        <w:br/>
+        <w:t>F03: Slot Viewing &amp; Availability Checking</w:t>
+      </w:r>
+      <w:r>
+        <w:br/>
+        <w:t>• View Available Time Slots</w:t>
+      </w:r>
+      <w:r>
+        <w:br/>
+        <w:t>• Check Real-Time Availability</w:t>
+      </w:r>
+      <w:r>
+        <w:br/>
+        <w:t>• View Court Schedule</w:t>
+      </w:r>
+      <w:r>
+        <w:br/>
+        <w:t>• View Peak/Off-Peak Hours</w:t>
+      </w:r>
+      <w:r>
+        <w:br/>
+      </w:r>
+      <w:r>
+        <w:br/>
+        <w:t>F04: Court Booking</w:t>
+      </w:r>
+      <w:r>
+        <w:br/>
+        <w:t>• Select Court</w:t>
+      </w:r>
+      <w:r>
+        <w:br/>
+        <w:t>• Select Date and Time Slot</w:t>
+      </w:r>
+      <w:r>
+        <w:br/>
+        <w:t>• Create Booking</w:t>
+      </w:r>
+      <w:r>
+        <w:br/>
+        <w:t>• Confirm Booking</w:t>
+      </w:r>
+      <w:r>
+        <w:br/>
+        <w:t>• Receive Booking Confirmation</w:t>
+      </w:r>
+      <w:r>
+        <w:br/>
+      </w:r>
+      <w:r>
+        <w:br/>
+        <w:t>F05: Payment Processing</w:t>
+      </w:r>
+      <w:r>
+        <w:br/>
+        <w:t>• Pay via QR Code</w:t>
+      </w:r>
+      <w:r>
+        <w:br/>
+        <w:t>• Pay via E-Wallet</w:t>
+      </w:r>
+      <w:r>
+        <w:br/>
+        <w:t>• Pay via Bank Transfer</w:t>
+      </w:r>
+      <w:r>
+        <w:br/>
+        <w:t>• View Payment Status</w:t>
+      </w:r>
+      <w:r>
+        <w:br/>
+        <w:t>• Download Payment Receipt</w:t>
+      </w:r>
+      <w:r>
+        <w:br/>
+      </w:r>
+      <w:r>
+        <w:br/>
+        <w:t>F06: Booking Management</w:t>
+      </w:r>
+      <w:r>
+        <w:br/>
+        <w:t>• View Booking History</w:t>
+      </w:r>
+      <w:r>
+        <w:br/>
+        <w:t>• View Booking Details</w:t>
+      </w:r>
+      <w:r>
+        <w:br/>
+        <w:t>• Cancel Booking</w:t>
+      </w:r>
+      <w:r>
+        <w:br/>
+        <w:t>• Reschedule Booking</w:t>
+      </w:r>
+      <w:r>
+        <w:br/>
+        <w:t>• Rebook Previous Booking</w:t>
+      </w:r>
+      <w:r>
+        <w:br/>
+      </w:r>
+      <w:r>
+        <w:br/>
+        <w:t>F07: Check-in &amp; QR Booking</w:t>
+      </w:r>
+      <w:r>
+        <w:br/>
+        <w:t>• Generate Booking QR Code</w:t>
+      </w:r>
+      <w:r>
+        <w:br/>
+        <w:t>• View QR Code</w:t>
+      </w:r>
+      <w:r>
+        <w:br/>
+        <w:t>• Check-in via QR Code</w:t>
+      </w:r>
+      <w:r>
+        <w:br/>
+        <w:t>• Verify Booking Status</w:t>
+      </w:r>
+      <w:r>
+        <w:br/>
+      </w:r>
+      <w:r>
+        <w:br/>
+        <w:t>F08: Reviews &amp; Feedback</w:t>
+      </w:r>
+      <w:r>
+        <w:br/>
+        <w:t>• Rate Court</w:t>
+      </w:r>
+      <w:r>
+        <w:br/>
+        <w:t>• Submit Feedback</w:t>
+      </w:r>
+      <w:r>
+        <w:br/>
+        <w:t>• View Reviews</w:t>
+      </w:r>
+      <w:r>
+        <w:br/>
+        <w:t>• Edit Feedback</w:t>
+      </w:r>
+      <w:r>
+        <w:br/>
+      </w:r>
+      <w:r>
+        <w:br/>
+        <w:t>F09: Notifications</w:t>
+      </w:r>
+      <w:r>
+        <w:br/>
+        <w:t>• Receive Booking Confirmation</w:t>
+      </w:r>
+      <w:r>
+        <w:br/>
+        <w:t>• Receive Payment Confirmation</w:t>
+      </w:r>
+      <w:r>
+        <w:br/>
+        <w:t>• Receive Booking Reminder</w:t>
+      </w:r>
+      <w:r>
+        <w:br/>
+        <w:t>• Receive Promotion Notifications</w:t>
+      </w:r>
+      <w:r>
+        <w:br/>
+      </w:r>
+      <w:r>
+        <w:br/>
       </w:r>
     </w:p>
-    <w:p>
-      <w:pPr>
-        <w:pStyle w:val="ListParagraph"/>
-        <w:numPr>
-          <w:ilvl w:val="0"/>
-          <w:numId w:val="3"/>
-        </w:numPr>
-      </w:pPr>
-      <w:r>
-        <w:t>F02: Shopping Cart Management – Add product to cart, view cart, Edit Cart (Change Quantity, Remove Items).</w:t>
-      </w:r>
-    </w:p>
-    <w:p>
-      <w:pPr>
-        <w:pStyle w:val="ListParagraph"/>
-        <w:numPr>
-          <w:ilvl w:val="0"/>
-          <w:numId w:val="3"/>
-        </w:numPr>
-      </w:pPr>
-      <w:r>
-        <w:t>F03: Order Placement – Add product to cart, view cart, edit cart, Checkout.</w:t>
-      </w:r>
-    </w:p>
-    <w:p>
-      <w:pPr>
-        <w:pStyle w:val="ListParagraph"/>
-        <w:numPr>
-          <w:ilvl w:val="0"/>
-          <w:numId w:val="3"/>
-        </w:numPr>
-      </w:pPr>
-      <w:r>
-        <w:t>F04: Customer Authentication – Register/Login (Google/Facebook), manage profile (View personal information, update profile).</w:t>
-      </w:r>
-    </w:p>
-    <w:p>
-      <w:pPr>
-        <w:pStyle w:val="ListParagraph"/>
-        <w:numPr>
-          <w:ilvl w:val="0"/>
-          <w:numId w:val="3"/>
-        </w:numPr>
-      </w:pPr>
-      <w:r>
-        <w:t>F05: My Order History – View order history, Cancel order, Send feedback, View order detail, ReOrder, Delete Order.</w:t>
-      </w:r>
-    </w:p>
-    <w:p>
-      <w:pPr>
-        <w:pStyle w:val="ListParagraph"/>
-        <w:numPr>
-          <w:ilvl w:val="0"/>
-          <w:numId w:val="3"/>
-        </w:numPr>
-      </w:pPr>
-      <w:r>
-        <w:t>F06: Viewing News – View news, Search news.</w:t>
-      </w:r>
-    </w:p>
-    <w:p/>
     <w:p>
       <w:pPr>
         <w:pStyle w:val="Heading3"/>
       </w:pPr>
       <w:r>
+        <w:t xml:space="preserve">I.2.2 Features for </w:t>
+      </w:r>
+      <w:r>
+        <w:t>Manager</w:t>
+      </w:r>
+    </w:p>
+    <w:p>
+      <w:r>
         <w:lastRenderedPageBreak/>
-        <w:t>I.2.2 Features for Staff</w:t>
+        <w:t>F10: Branch Management</w:t>
+      </w:r>
+      <w:r>
+        <w:br/>
+        <w:t>• View Branch Information</w:t>
+      </w:r>
+      <w:r>
+        <w:br/>
+        <w:t>• Update Branch Information</w:t>
+      </w:r>
+      <w:r>
+        <w:br/>
+        <w:t>• Manage Branch Status</w:t>
+      </w:r>
+      <w:r>
+        <w:br/>
+        <w:t>• View Branch Statistics</w:t>
+      </w:r>
+      <w:r>
+        <w:br/>
+      </w:r>
+      <w:r>
+        <w:br/>
+        <w:t>F11: Court Management</w:t>
+      </w:r>
+      <w:r>
+        <w:br/>
+        <w:t>• Add Court</w:t>
+      </w:r>
+      <w:r>
+        <w:br/>
+        <w:t>• Edit Court</w:t>
+      </w:r>
+      <w:r>
+        <w:br/>
+        <w:t>• Delete Court</w:t>
+      </w:r>
+      <w:r>
+        <w:br/>
+        <w:t>• Manage Court Status</w:t>
+      </w:r>
+      <w:r>
+        <w:br/>
+        <w:t>• Search Courts</w:t>
+      </w:r>
+      <w:r>
+        <w:br/>
+        <w:t>• Filter Courts</w:t>
+      </w:r>
+      <w:r>
+        <w:br/>
+      </w:r>
+      <w:r>
+        <w:br/>
+        <w:t>F12: Slot Management</w:t>
+      </w:r>
+      <w:r>
+        <w:br/>
+        <w:t>• Create Time Slots</w:t>
+      </w:r>
+      <w:r>
+        <w:br/>
+        <w:t>• Edit Time Slots</w:t>
+      </w:r>
+      <w:r>
+        <w:br/>
+        <w:t>• Delete Time Slots</w:t>
+      </w:r>
+      <w:r>
+        <w:br/>
+        <w:t>• Configure Operating Hours</w:t>
+      </w:r>
+      <w:r>
+        <w:br/>
+        <w:t>• Block Maintenance Slots</w:t>
+      </w:r>
+      <w:r>
+        <w:br/>
+      </w:r>
+      <w:r>
+        <w:br/>
+        <w:t>F13: Booking Management</w:t>
+      </w:r>
+      <w:r>
+        <w:br/>
+        <w:t>• View Booking List</w:t>
+      </w:r>
+      <w:r>
+        <w:br/>
+        <w:t>• View Booking Details</w:t>
+      </w:r>
+      <w:r>
+        <w:br/>
+        <w:t>• Approve Booking</w:t>
+      </w:r>
+      <w:r>
+        <w:br/>
+        <w:t>• Cancel Booking</w:t>
+      </w:r>
+      <w:r>
+        <w:br/>
+        <w:t>• Update Booking Status</w:t>
+      </w:r>
+      <w:r>
+        <w:br/>
+      </w:r>
+      <w:r>
+        <w:br/>
+        <w:t>F14: Check-in &amp; Walk-in Management</w:t>
+      </w:r>
+      <w:r>
+        <w:br/>
+        <w:t>• Check-in Customer</w:t>
+      </w:r>
+      <w:r>
+        <w:br/>
+        <w:t>• Create Walk-in Booking</w:t>
+      </w:r>
+      <w:r>
+        <w:br/>
+        <w:t>• Verify QR Booking</w:t>
+      </w:r>
+      <w:r>
+        <w:br/>
+        <w:t>• Manage Attendance</w:t>
+      </w:r>
+      <w:r>
+        <w:br/>
+      </w:r>
+      <w:r>
+        <w:br/>
+        <w:t>F15: Staff Management</w:t>
+      </w:r>
+      <w:r>
+        <w:br/>
+        <w:t>• Add Staff</w:t>
+      </w:r>
+      <w:r>
+        <w:br/>
+        <w:t>• Edit Staff</w:t>
+      </w:r>
+      <w:r>
+        <w:br/>
+        <w:t>• Delete Staff</w:t>
+      </w:r>
+      <w:r>
+        <w:br/>
+        <w:t>• Assign Roles</w:t>
+      </w:r>
+      <w:r>
+        <w:br/>
+        <w:t>• Manage Staff Accounts</w:t>
+      </w:r>
+      <w:r>
+        <w:br/>
+      </w:r>
+      <w:r>
+        <w:br/>
       </w:r>
     </w:p>
     <w:p>
       <w:pPr>
-        <w:pStyle w:val="ListParagraph"/>
-        <w:numPr>
-          <w:ilvl w:val="0"/>
-          <w:numId w:val="3"/>
-        </w:numPr>
+        <w:pStyle w:val="Heading3"/>
       </w:pPr>
       <w:r>
-        <w:t>F07: Product Category Management – Add, Edit, Delete, Sort, Search Product Category.</w:t>
+        <w:t>I.2.</w:t>
+      </w:r>
+      <w:r>
+        <w:t>3</w:t>
+      </w:r>
+      <w:r>
+        <w:t xml:space="preserve"> Features for Staff</w:t>
+      </w:r>
+    </w:p>
+    <w:p>
+      <w:r>
+        <w:t>F16: Customer Support</w:t>
+      </w:r>
+      <w:r>
+        <w:br/>
+        <w:t>• View Customer Requests</w:t>
+      </w:r>
+      <w:r>
+        <w:br/>
+        <w:t>• Handle Complaints</w:t>
+      </w:r>
+      <w:r>
+        <w:br/>
+        <w:t>• Resolve Booking Issues</w:t>
+      </w:r>
+      <w:r>
+        <w:br/>
+        <w:t>• Support Refund Requests</w:t>
+      </w:r>
+      <w:r>
+        <w:br/>
+      </w:r>
+      <w:r>
+        <w:br/>
+        <w:t>F17: Payment Monitoring</w:t>
+      </w:r>
+      <w:r>
+        <w:br/>
+        <w:t>• Verify Payments</w:t>
+      </w:r>
+      <w:r>
+        <w:br/>
+        <w:t>• Track Failed Transactions</w:t>
+      </w:r>
+      <w:r>
+        <w:br/>
+        <w:t>• Process Refund Requests</w:t>
+      </w:r>
+      <w:r>
+        <w:br/>
+      </w:r>
+      <w:r>
+        <w:lastRenderedPageBreak/>
+        <w:t>• Generate Payment Reports</w:t>
+      </w:r>
+      <w:r>
+        <w:br/>
       </w:r>
     </w:p>
     <w:p>
       <w:pPr>
-        <w:pStyle w:val="ListParagraph"/>
-        <w:numPr>
-          <w:ilvl w:val="0"/>
-          <w:numId w:val="3"/>
-        </w:numPr>
+        <w:pStyle w:val="Heading3"/>
       </w:pPr>
       <w:r>
-        <w:t>F08: Product Management – Add, Edit, Delete Product, Search, Sort.</w:t>
+        <w:t>I.2.</w:t>
+      </w:r>
+      <w:r>
+        <w:t>4</w:t>
+      </w:r>
+      <w:r>
+        <w:t xml:space="preserve"> Features for </w:t>
+      </w:r>
+      <w:r>
+        <w:t>Superadmin</w:t>
       </w:r>
     </w:p>
     <w:p>
-      <w:pPr>
-        <w:pStyle w:val="ListParagraph"/>
-        <w:numPr>
-          <w:ilvl w:val="0"/>
-          <w:numId w:val="3"/>
-        </w:numPr>
-      </w:pPr>
-      <w:r>
-        <w:t>F09: Supplier Management – Add, Edit, Delete Supplier, Search, Sort.</w:t>
-      </w:r>
-    </w:p>
-    <w:p>
-      <w:pPr>
-        <w:pStyle w:val="ListParagraph"/>
-        <w:numPr>
-          <w:ilvl w:val="0"/>
-          <w:numId w:val="3"/>
-        </w:numPr>
-      </w:pPr>
-      <w:r>
-        <w:t>F10: Import Bill Management – Record Product Import (Add, Edit, Delete Import Bill), Search, Sort.</w:t>
-      </w:r>
-    </w:p>
-    <w:p>
-      <w:pPr>
-        <w:pStyle w:val="ListParagraph"/>
-        <w:numPr>
-          <w:ilvl w:val="0"/>
-          <w:numId w:val="3"/>
-        </w:numPr>
-      </w:pPr>
-      <w:r>
-        <w:t>F11: Order Processing – View order list, View order details, Print Order, Confirm order, Confirm Order for Packing, Confirm Delivery Successful, Confirm Returned Order, Handle Customer Feedback.</w:t>
-      </w:r>
-    </w:p>
-    <w:p>
-      <w:pPr>
-        <w:pStyle w:val="ListParagraph"/>
-        <w:numPr>
-          <w:ilvl w:val="0"/>
-          <w:numId w:val="3"/>
-        </w:numPr>
-      </w:pPr>
-      <w:r>
-        <w:t>F12: Discounts Management – Create Discounts, Edit Discounts, Delete Discount.</w:t>
-      </w:r>
-    </w:p>
-    <w:p>
-      <w:pPr>
-        <w:pStyle w:val="ListParagraph"/>
-        <w:numPr>
-          <w:ilvl w:val="0"/>
-          <w:numId w:val="3"/>
-        </w:numPr>
-      </w:pPr>
-      <w:r>
-        <w:t>F13: News Management – View news details, Add news, Edit News, Delete News, Disable news, Enable news.</w:t>
-      </w:r>
-    </w:p>
-    <w:p>
-      <w:pPr>
-        <w:pStyle w:val="ListParagraph"/>
-        <w:numPr>
-          <w:ilvl w:val="0"/>
-          <w:numId w:val="3"/>
-        </w:numPr>
-      </w:pPr>
-      <w:r>
-        <w:t>F14: User Management – Login of Staff, Create staff, Assign staff permission, Revoke staff permission.</w:t>
-      </w:r>
-    </w:p>
-    <w:p>
-      <w:pPr>
-        <w:pStyle w:val="ListParagraph"/>
-        <w:numPr>
-          <w:ilvl w:val="0"/>
-          <w:numId w:val="3"/>
-        </w:numPr>
-      </w:pPr>
-      <w:r>
-        <w:t>F15: Inventory Statistics – Statistics on expired products, statistics on out-of-stock products.</w:t>
+      <w:r>
+        <w:t>F18: User Management</w:t>
+      </w:r>
+      <w:r>
+        <w:br/>
+        <w:t>• View User List</w:t>
+      </w:r>
+      <w:r>
+        <w:br/>
+        <w:t>• Create User</w:t>
+      </w:r>
+      <w:r>
+        <w:br/>
+        <w:t>• Edit User</w:t>
+      </w:r>
+      <w:r>
+        <w:br/>
+        <w:t>• Delete User</w:t>
+      </w:r>
+      <w:r>
+        <w:br/>
+        <w:t>• Activate/Deactivate User</w:t>
+      </w:r>
+      <w:r>
+        <w:br/>
+        <w:t>• Assign Roles</w:t>
+      </w:r>
+      <w:r>
+        <w:br/>
+      </w:r>
+      <w:r>
+        <w:br/>
+        <w:t>F19: Role &amp; Permission Management</w:t>
+      </w:r>
+      <w:r>
+        <w:br/>
+        <w:t>• Create Roles</w:t>
+      </w:r>
+      <w:r>
+        <w:br/>
+        <w:t>• Edit Roles</w:t>
+      </w:r>
+      <w:r>
+        <w:br/>
+        <w:t>• Delete Roles</w:t>
+      </w:r>
+      <w:r>
+        <w:br/>
+        <w:t>• Assign Permissions</w:t>
+      </w:r>
+      <w:r>
+        <w:br/>
+        <w:t>• Revoke Permissions</w:t>
+      </w:r>
+      <w:r>
+        <w:br/>
+      </w:r>
+      <w:r>
+        <w:br/>
+        <w:t>F20: Branch Administration</w:t>
+      </w:r>
+      <w:r>
+        <w:br/>
+        <w:t>• Add Branch</w:t>
+      </w:r>
+      <w:r>
+        <w:br/>
+        <w:t>• Edit Branch</w:t>
+      </w:r>
+      <w:r>
+        <w:br/>
+        <w:t>• Delete Branch</w:t>
+      </w:r>
+      <w:r>
+        <w:br/>
+        <w:t>• Assign Branch Manager</w:t>
+      </w:r>
+      <w:r>
+        <w:br/>
+      </w:r>
+      <w:r>
+        <w:br/>
+        <w:t>F21: System Configuration</w:t>
+      </w:r>
+      <w:r>
+        <w:br/>
+        <w:t>• Configure Booking Rules</w:t>
+      </w:r>
+      <w:r>
+        <w:br/>
+        <w:t>• Configure Payment Settings</w:t>
+      </w:r>
+      <w:r>
+        <w:br/>
+        <w:t>• Configure Notification Settings</w:t>
+      </w:r>
+      <w:r>
+        <w:br/>
+        <w:t>• Configure Business Hours</w:t>
+      </w:r>
+      <w:r>
+        <w:br/>
+      </w:r>
+      <w:r>
+        <w:br/>
+        <w:t>F22: Dashboard &amp; Statistics</w:t>
+      </w:r>
+      <w:r>
+        <w:br/>
+        <w:t>• Revenue Statistics</w:t>
+      </w:r>
+      <w:r>
+        <w:br/>
+        <w:t>• Booking Statistics</w:t>
+      </w:r>
+      <w:r>
+        <w:br/>
+        <w:t>• Court Utilization Statistics</w:t>
+      </w:r>
+      <w:r>
+        <w:br/>
+        <w:t>• Customer Statistics</w:t>
+      </w:r>
+      <w:r>
+        <w:br/>
+        <w:t>• Branch Performance Statistics</w:t>
+      </w:r>
+      <w:r>
+        <w:br/>
       </w:r>
     </w:p>
     <w:p/>
@@ -883,6 +1318,7 @@
           <w:b/>
           <w:bCs/>
         </w:rPr>
+        <w:lastRenderedPageBreak/>
         <w:t>External Systems:</w:t>
       </w:r>
     </w:p>
@@ -966,12 +1402,6 @@
         <w:gridCol w:w="5026"/>
       </w:tblGrid>
       <w:tr>
-        <w:tblPrEx>
-          <w:tblCellMar>
-            <w:top w:w="0" w:type="dxa"/>
-            <w:bottom w:w="0" w:type="dxa"/>
-          </w:tblCellMar>
-        </w:tblPrEx>
         <w:tc>
           <w:tcPr>
             <w:tcW w:w="1500" w:type="dxa"/>
@@ -1064,12 +1494,6 @@
         </w:tc>
       </w:tr>
       <w:tr>
-        <w:tblPrEx>
-          <w:tblCellMar>
-            <w:top w:w="0" w:type="dxa"/>
-            <w:bottom w:w="0" w:type="dxa"/>
-          </w:tblCellMar>
-        </w:tblPrEx>
         <w:tc>
           <w:tcPr>
             <w:tcW w:w="1500" w:type="dxa"/>
@@ -1153,12 +1577,6 @@
         </w:tc>
       </w:tr>
       <w:tr>
-        <w:tblPrEx>
-          <w:tblCellMar>
-            <w:top w:w="0" w:type="dxa"/>
-            <w:bottom w:w="0" w:type="dxa"/>
-          </w:tblCellMar>
-        </w:tblPrEx>
         <w:tc>
           <w:tcPr>
             <w:tcW w:w="1500" w:type="dxa"/>
@@ -1242,12 +1660,6 @@
         </w:tc>
       </w:tr>
       <w:tr>
-        <w:tblPrEx>
-          <w:tblCellMar>
-            <w:top w:w="0" w:type="dxa"/>
-            <w:bottom w:w="0" w:type="dxa"/>
-          </w:tblCellMar>
-        </w:tblPrEx>
         <w:tc>
           <w:tcPr>
             <w:tcW w:w="1500" w:type="dxa"/>
@@ -1331,12 +1743,6 @@
         </w:tc>
       </w:tr>
       <w:tr>
-        <w:tblPrEx>
-          <w:tblCellMar>
-            <w:top w:w="0" w:type="dxa"/>
-            <w:bottom w:w="0" w:type="dxa"/>
-          </w:tblCellMar>
-        </w:tblPrEx>
         <w:tc>
           <w:tcPr>
             <w:tcW w:w="1500" w:type="dxa"/>
@@ -1360,7 +1766,6 @@
                 <w:sz w:val="20"/>
                 <w:szCs w:val="20"/>
               </w:rPr>
-              <w:lastRenderedPageBreak/>
               <w:t>NF-04</w:t>
             </w:r>
           </w:p>
@@ -1518,12 +1923,6 @@
         <w:gridCol w:w="6826"/>
       </w:tblGrid>
       <w:tr>
-        <w:tblPrEx>
-          <w:tblCellMar>
-            <w:top w:w="0" w:type="dxa"/>
-            <w:bottom w:w="0" w:type="dxa"/>
-          </w:tblCellMar>
-        </w:tblPrEx>
         <w:tc>
           <w:tcPr>
             <w:tcW w:w="2200" w:type="dxa"/>
@@ -1581,12 +1980,6 @@
         </w:tc>
       </w:tr>
       <w:tr>
-        <w:tblPrEx>
-          <w:tblCellMar>
-            <w:top w:w="0" w:type="dxa"/>
-            <w:bottom w:w="0" w:type="dxa"/>
-          </w:tblCellMar>
-        </w:tblPrEx>
         <w:tc>
           <w:tcPr>
             <w:tcW w:w="2200" w:type="dxa"/>
@@ -1644,12 +2037,6 @@
         </w:tc>
       </w:tr>
       <w:tr>
-        <w:tblPrEx>
-          <w:tblCellMar>
-            <w:top w:w="0" w:type="dxa"/>
-            <w:bottom w:w="0" w:type="dxa"/>
-          </w:tblCellMar>
-        </w:tblPrEx>
         <w:tc>
           <w:tcPr>
             <w:tcW w:w="2200" w:type="dxa"/>
@@ -1707,12 +2094,6 @@
         </w:tc>
       </w:tr>
       <w:tr>
-        <w:tblPrEx>
-          <w:tblCellMar>
-            <w:top w:w="0" w:type="dxa"/>
-            <w:bottom w:w="0" w:type="dxa"/>
-          </w:tblCellMar>
-        </w:tblPrEx>
         <w:tc>
           <w:tcPr>
             <w:tcW w:w="2200" w:type="dxa"/>
@@ -1770,12 +2151,6 @@
         </w:tc>
       </w:tr>
       <w:tr>
-        <w:tblPrEx>
-          <w:tblCellMar>
-            <w:top w:w="0" w:type="dxa"/>
-            <w:bottom w:w="0" w:type="dxa"/>
-          </w:tblCellMar>
-        </w:tblPrEx>
         <w:tc>
           <w:tcPr>
             <w:tcW w:w="2200" w:type="dxa"/>
@@ -1833,12 +2208,6 @@
         </w:tc>
       </w:tr>
       <w:tr>
-        <w:tblPrEx>
-          <w:tblCellMar>
-            <w:top w:w="0" w:type="dxa"/>
-            <w:bottom w:w="0" w:type="dxa"/>
-          </w:tblCellMar>
-        </w:tblPrEx>
         <w:tc>
           <w:tcPr>
             <w:tcW w:w="2200" w:type="dxa"/>
@@ -1864,6 +2233,7 @@
                 <w:sz w:val="20"/>
                 <w:szCs w:val="20"/>
               </w:rPr>
+              <w:lastRenderedPageBreak/>
               <w:t>Postconditions</w:t>
             </w:r>
           </w:p>
@@ -1896,12 +2266,6 @@
         </w:tc>
       </w:tr>
       <w:tr>
-        <w:tblPrEx>
-          <w:tblCellMar>
-            <w:top w:w="0" w:type="dxa"/>
-            <w:bottom w:w="0" w:type="dxa"/>
-          </w:tblCellMar>
-        </w:tblPrEx>
         <w:tc>
           <w:tcPr>
             <w:tcW w:w="2200" w:type="dxa"/>
@@ -1959,12 +2323,6 @@
         </w:tc>
       </w:tr>
       <w:tr>
-        <w:tblPrEx>
-          <w:tblCellMar>
-            <w:top w:w="0" w:type="dxa"/>
-            <w:bottom w:w="0" w:type="dxa"/>
-          </w:tblCellMar>
-        </w:tblPrEx>
         <w:tc>
           <w:tcPr>
             <w:tcW w:w="2200" w:type="dxa"/>
@@ -2055,12 +2413,6 @@
         <w:gridCol w:w="6826"/>
       </w:tblGrid>
       <w:tr>
-        <w:tblPrEx>
-          <w:tblCellMar>
-            <w:top w:w="0" w:type="dxa"/>
-            <w:bottom w:w="0" w:type="dxa"/>
-          </w:tblCellMar>
-        </w:tblPrEx>
         <w:tc>
           <w:tcPr>
             <w:tcW w:w="2200" w:type="dxa"/>
@@ -2118,12 +2470,6 @@
         </w:tc>
       </w:tr>
       <w:tr>
-        <w:tblPrEx>
-          <w:tblCellMar>
-            <w:top w:w="0" w:type="dxa"/>
-            <w:bottom w:w="0" w:type="dxa"/>
-          </w:tblCellMar>
-        </w:tblPrEx>
         <w:tc>
           <w:tcPr>
             <w:tcW w:w="2200" w:type="dxa"/>
@@ -2181,12 +2527,6 @@
         </w:tc>
       </w:tr>
       <w:tr>
-        <w:tblPrEx>
-          <w:tblCellMar>
-            <w:top w:w="0" w:type="dxa"/>
-            <w:bottom w:w="0" w:type="dxa"/>
-          </w:tblCellMar>
-        </w:tblPrEx>
         <w:tc>
           <w:tcPr>
             <w:tcW w:w="2200" w:type="dxa"/>
@@ -2244,12 +2584,6 @@
         </w:tc>
       </w:tr>
       <w:tr>
-        <w:tblPrEx>
-          <w:tblCellMar>
-            <w:top w:w="0" w:type="dxa"/>
-            <w:bottom w:w="0" w:type="dxa"/>
-          </w:tblCellMar>
-        </w:tblPrEx>
         <w:tc>
           <w:tcPr>
             <w:tcW w:w="2200" w:type="dxa"/>
@@ -2307,12 +2641,6 @@
         </w:tc>
       </w:tr>
       <w:tr>
-        <w:tblPrEx>
-          <w:tblCellMar>
-            <w:top w:w="0" w:type="dxa"/>
-            <w:bottom w:w="0" w:type="dxa"/>
-          </w:tblCellMar>
-        </w:tblPrEx>
         <w:tc>
           <w:tcPr>
             <w:tcW w:w="2200" w:type="dxa"/>
@@ -2370,12 +2698,6 @@
         </w:tc>
       </w:tr>
       <w:tr>
-        <w:tblPrEx>
-          <w:tblCellMar>
-            <w:top w:w="0" w:type="dxa"/>
-            <w:bottom w:w="0" w:type="dxa"/>
-          </w:tblCellMar>
-        </w:tblPrEx>
         <w:tc>
           <w:tcPr>
             <w:tcW w:w="2200" w:type="dxa"/>
@@ -2433,12 +2755,6 @@
         </w:tc>
       </w:tr>
       <w:tr>
-        <w:tblPrEx>
-          <w:tblCellMar>
-            <w:top w:w="0" w:type="dxa"/>
-            <w:bottom w:w="0" w:type="dxa"/>
-          </w:tblCellMar>
-        </w:tblPrEx>
         <w:tc>
           <w:tcPr>
             <w:tcW w:w="2200" w:type="dxa"/>
@@ -2490,26 +2806,12 @@
                 <w:sz w:val="20"/>
                 <w:szCs w:val="20"/>
               </w:rPr>
-              <w:t xml:space="preserve">1. WS selects Add Product. 2. System displays the add product form. 3. System retrieves and populates product categories dropdown. 4. WS fills </w:t>
-            </w:r>
-            <w:r>
-              <w:rPr>
-                <w:sz w:val="20"/>
-                <w:szCs w:val="20"/>
-              </w:rPr>
-              <w:lastRenderedPageBreak/>
-              <w:t>product details and selects a category. (See A4.1) 5. WS submits the form. 6. System validates input. (See E6.1) 7. System adds the product. (See E7.1) 8. System displays confirmation message.</w:t>
+              <w:t>1. WS selects Add Product. 2. System displays the add product form. 3. System retrieves and populates product categories dropdown. 4. WS fills product details and selects a category. (See A4.1) 5. WS submits the form. 6. System validates input. (See E6.1) 7. System adds the product. (See E7.1) 8. System displays confirmation message.</w:t>
             </w:r>
           </w:p>
         </w:tc>
       </w:tr>
       <w:tr>
-        <w:tblPrEx>
-          <w:tblCellMar>
-            <w:top w:w="0" w:type="dxa"/>
-            <w:bottom w:w="0" w:type="dxa"/>
-          </w:tblCellMar>
-        </w:tblPrEx>
         <w:tc>
           <w:tcPr>
             <w:tcW w:w="2200" w:type="dxa"/>
@@ -2535,7 +2837,6 @@
                 <w:sz w:val="20"/>
                 <w:szCs w:val="20"/>
               </w:rPr>
-              <w:lastRenderedPageBreak/>
               <w:t>Alternative Flows</w:t>
             </w:r>
           </w:p>
@@ -2568,12 +2869,6 @@
         </w:tc>
       </w:tr>
       <w:tr>
-        <w:tblPrEx>
-          <w:tblCellMar>
-            <w:top w:w="0" w:type="dxa"/>
-            <w:bottom w:w="0" w:type="dxa"/>
-          </w:tblCellMar>
-        </w:tblPrEx>
         <w:tc>
           <w:tcPr>
             <w:tcW w:w="2200" w:type="dxa"/>
@@ -2631,12 +2926,6 @@
         </w:tc>
       </w:tr>
       <w:tr>
-        <w:tblPrEx>
-          <w:tblCellMar>
-            <w:top w:w="0" w:type="dxa"/>
-            <w:bottom w:w="0" w:type="dxa"/>
-          </w:tblCellMar>
-        </w:tblPrEx>
         <w:tc>
           <w:tcPr>
             <w:tcW w:w="2200" w:type="dxa"/>
@@ -2727,12 +3016,6 @@
         <w:gridCol w:w="6826"/>
       </w:tblGrid>
       <w:tr>
-        <w:tblPrEx>
-          <w:tblCellMar>
-            <w:top w:w="0" w:type="dxa"/>
-            <w:bottom w:w="0" w:type="dxa"/>
-          </w:tblCellMar>
-        </w:tblPrEx>
         <w:tc>
           <w:tcPr>
             <w:tcW w:w="2200" w:type="dxa"/>
@@ -2790,12 +3073,6 @@
         </w:tc>
       </w:tr>
       <w:tr>
-        <w:tblPrEx>
-          <w:tblCellMar>
-            <w:top w:w="0" w:type="dxa"/>
-            <w:bottom w:w="0" w:type="dxa"/>
-          </w:tblCellMar>
-        </w:tblPrEx>
         <w:tc>
           <w:tcPr>
             <w:tcW w:w="2200" w:type="dxa"/>
@@ -2853,12 +3130,6 @@
         </w:tc>
       </w:tr>
       <w:tr>
-        <w:tblPrEx>
-          <w:tblCellMar>
-            <w:top w:w="0" w:type="dxa"/>
-            <w:bottom w:w="0" w:type="dxa"/>
-          </w:tblCellMar>
-        </w:tblPrEx>
         <w:tc>
           <w:tcPr>
             <w:tcW w:w="2200" w:type="dxa"/>
@@ -2916,12 +3187,6 @@
         </w:tc>
       </w:tr>
       <w:tr>
-        <w:tblPrEx>
-          <w:tblCellMar>
-            <w:top w:w="0" w:type="dxa"/>
-            <w:bottom w:w="0" w:type="dxa"/>
-          </w:tblCellMar>
-        </w:tblPrEx>
         <w:tc>
           <w:tcPr>
             <w:tcW w:w="2200" w:type="dxa"/>
@@ -2979,12 +3244,6 @@
         </w:tc>
       </w:tr>
       <w:tr>
-        <w:tblPrEx>
-          <w:tblCellMar>
-            <w:top w:w="0" w:type="dxa"/>
-            <w:bottom w:w="0" w:type="dxa"/>
-          </w:tblCellMar>
-        </w:tblPrEx>
         <w:tc>
           <w:tcPr>
             <w:tcW w:w="2200" w:type="dxa"/>
@@ -3042,12 +3301,6 @@
         </w:tc>
       </w:tr>
       <w:tr>
-        <w:tblPrEx>
-          <w:tblCellMar>
-            <w:top w:w="0" w:type="dxa"/>
-            <w:bottom w:w="0" w:type="dxa"/>
-          </w:tblCellMar>
-        </w:tblPrEx>
         <w:tc>
           <w:tcPr>
             <w:tcW w:w="2200" w:type="dxa"/>
@@ -3105,12 +3358,6 @@
         </w:tc>
       </w:tr>
       <w:tr>
-        <w:tblPrEx>
-          <w:tblCellMar>
-            <w:top w:w="0" w:type="dxa"/>
-            <w:bottom w:w="0" w:type="dxa"/>
-          </w:tblCellMar>
-        </w:tblPrEx>
         <w:tc>
           <w:tcPr>
             <w:tcW w:w="2200" w:type="dxa"/>
@@ -3168,12 +3415,6 @@
         </w:tc>
       </w:tr>
       <w:tr>
-        <w:tblPrEx>
-          <w:tblCellMar>
-            <w:top w:w="0" w:type="dxa"/>
-            <w:bottom w:w="0" w:type="dxa"/>
-          </w:tblCellMar>
-        </w:tblPrEx>
         <w:tc>
           <w:tcPr>
             <w:tcW w:w="2200" w:type="dxa"/>
@@ -3231,12 +3472,6 @@
         </w:tc>
       </w:tr>
       <w:tr>
-        <w:tblPrEx>
-          <w:tblCellMar>
-            <w:top w:w="0" w:type="dxa"/>
-            <w:bottom w:w="0" w:type="dxa"/>
-          </w:tblCellMar>
-        </w:tblPrEx>
         <w:tc>
           <w:tcPr>
             <w:tcW w:w="2200" w:type="dxa"/>
@@ -3294,12 +3529,6 @@
         </w:tc>
       </w:tr>
       <w:tr>
-        <w:tblPrEx>
-          <w:tblCellMar>
-            <w:top w:w="0" w:type="dxa"/>
-            <w:bottom w:w="0" w:type="dxa"/>
-          </w:tblCellMar>
-        </w:tblPrEx>
         <w:tc>
           <w:tcPr>
             <w:tcW w:w="2200" w:type="dxa"/>
@@ -3364,6 +3593,7 @@
           <w:b/>
           <w:bCs/>
         </w:rPr>
+        <w:lastRenderedPageBreak/>
         <w:t>Table I-4: Use Case – UC-04 Delete Product</w:t>
       </w:r>
     </w:p>
@@ -3390,12 +3620,6 @@
         <w:gridCol w:w="6826"/>
       </w:tblGrid>
       <w:tr>
-        <w:tblPrEx>
-          <w:tblCellMar>
-            <w:top w:w="0" w:type="dxa"/>
-            <w:bottom w:w="0" w:type="dxa"/>
-          </w:tblCellMar>
-        </w:tblPrEx>
         <w:tc>
           <w:tcPr>
             <w:tcW w:w="2200" w:type="dxa"/>
@@ -3453,12 +3677,6 @@
         </w:tc>
       </w:tr>
       <w:tr>
-        <w:tblPrEx>
-          <w:tblCellMar>
-            <w:top w:w="0" w:type="dxa"/>
-            <w:bottom w:w="0" w:type="dxa"/>
-          </w:tblCellMar>
-        </w:tblPrEx>
         <w:tc>
           <w:tcPr>
             <w:tcW w:w="2200" w:type="dxa"/>
@@ -3516,12 +3734,6 @@
         </w:tc>
       </w:tr>
       <w:tr>
-        <w:tblPrEx>
-          <w:tblCellMar>
-            <w:top w:w="0" w:type="dxa"/>
-            <w:bottom w:w="0" w:type="dxa"/>
-          </w:tblCellMar>
-        </w:tblPrEx>
         <w:tc>
           <w:tcPr>
             <w:tcW w:w="2200" w:type="dxa"/>
@@ -3579,12 +3791,6 @@
         </w:tc>
       </w:tr>
       <w:tr>
-        <w:tblPrEx>
-          <w:tblCellMar>
-            <w:top w:w="0" w:type="dxa"/>
-            <w:bottom w:w="0" w:type="dxa"/>
-          </w:tblCellMar>
-        </w:tblPrEx>
         <w:tc>
           <w:tcPr>
             <w:tcW w:w="2200" w:type="dxa"/>
@@ -3642,12 +3848,6 @@
         </w:tc>
       </w:tr>
       <w:tr>
-        <w:tblPrEx>
-          <w:tblCellMar>
-            <w:top w:w="0" w:type="dxa"/>
-            <w:bottom w:w="0" w:type="dxa"/>
-          </w:tblCellMar>
-        </w:tblPrEx>
         <w:tc>
           <w:tcPr>
             <w:tcW w:w="2200" w:type="dxa"/>
@@ -3705,12 +3905,6 @@
         </w:tc>
       </w:tr>
       <w:tr>
-        <w:tblPrEx>
-          <w:tblCellMar>
-            <w:top w:w="0" w:type="dxa"/>
-            <w:bottom w:w="0" w:type="dxa"/>
-          </w:tblCellMar>
-        </w:tblPrEx>
         <w:tc>
           <w:tcPr>
             <w:tcW w:w="2200" w:type="dxa"/>
@@ -3768,12 +3962,6 @@
         </w:tc>
       </w:tr>
       <w:tr>
-        <w:tblPrEx>
-          <w:tblCellMar>
-            <w:top w:w="0" w:type="dxa"/>
-            <w:bottom w:w="0" w:type="dxa"/>
-          </w:tblCellMar>
-        </w:tblPrEx>
         <w:tc>
           <w:tcPr>
             <w:tcW w:w="2200" w:type="dxa"/>
@@ -3831,12 +4019,6 @@
         </w:tc>
       </w:tr>
       <w:tr>
-        <w:tblPrEx>
-          <w:tblCellMar>
-            <w:top w:w="0" w:type="dxa"/>
-            <w:bottom w:w="0" w:type="dxa"/>
-          </w:tblCellMar>
-        </w:tblPrEx>
         <w:tc>
           <w:tcPr>
             <w:tcW w:w="2200" w:type="dxa"/>
@@ -3894,12 +4076,6 @@
         </w:tc>
       </w:tr>
       <w:tr>
-        <w:tblPrEx>
-          <w:tblCellMar>
-            <w:top w:w="0" w:type="dxa"/>
-            <w:bottom w:w="0" w:type="dxa"/>
-          </w:tblCellMar>
-        </w:tblPrEx>
         <w:tc>
           <w:tcPr>
             <w:tcW w:w="2200" w:type="dxa"/>
@@ -3957,12 +4133,6 @@
         </w:tc>
       </w:tr>
       <w:tr>
-        <w:tblPrEx>
-          <w:tblCellMar>
-            <w:top w:w="0" w:type="dxa"/>
-            <w:bottom w:w="0" w:type="dxa"/>
-          </w:tblCellMar>
-        </w:tblPrEx>
         <w:tc>
           <w:tcPr>
             <w:tcW w:w="2200" w:type="dxa"/>
@@ -4027,7 +4197,6 @@
           <w:b/>
           <w:bCs/>
         </w:rPr>
-        <w:lastRenderedPageBreak/>
         <w:t>Table I-5: Use Case – UC-05 Disable News</w:t>
       </w:r>
     </w:p>
@@ -4054,12 +4223,6 @@
         <w:gridCol w:w="6826"/>
       </w:tblGrid>
       <w:tr>
-        <w:tblPrEx>
-          <w:tblCellMar>
-            <w:top w:w="0" w:type="dxa"/>
-            <w:bottom w:w="0" w:type="dxa"/>
-          </w:tblCellMar>
-        </w:tblPrEx>
         <w:tc>
           <w:tcPr>
             <w:tcW w:w="2200" w:type="dxa"/>
@@ -4117,12 +4280,6 @@
         </w:tc>
       </w:tr>
       <w:tr>
-        <w:tblPrEx>
-          <w:tblCellMar>
-            <w:top w:w="0" w:type="dxa"/>
-            <w:bottom w:w="0" w:type="dxa"/>
-          </w:tblCellMar>
-        </w:tblPrEx>
         <w:tc>
           <w:tcPr>
             <w:tcW w:w="2200" w:type="dxa"/>
@@ -4180,12 +4337,6 @@
         </w:tc>
       </w:tr>
       <w:tr>
-        <w:tblPrEx>
-          <w:tblCellMar>
-            <w:top w:w="0" w:type="dxa"/>
-            <w:bottom w:w="0" w:type="dxa"/>
-          </w:tblCellMar>
-        </w:tblPrEx>
         <w:tc>
           <w:tcPr>
             <w:tcW w:w="2200" w:type="dxa"/>
@@ -4243,12 +4394,6 @@
         </w:tc>
       </w:tr>
       <w:tr>
-        <w:tblPrEx>
-          <w:tblCellMar>
-            <w:top w:w="0" w:type="dxa"/>
-            <w:bottom w:w="0" w:type="dxa"/>
-          </w:tblCellMar>
-        </w:tblPrEx>
         <w:tc>
           <w:tcPr>
             <w:tcW w:w="2200" w:type="dxa"/>
@@ -4306,12 +4451,6 @@
         </w:tc>
       </w:tr>
       <w:tr>
-        <w:tblPrEx>
-          <w:tblCellMar>
-            <w:top w:w="0" w:type="dxa"/>
-            <w:bottom w:w="0" w:type="dxa"/>
-          </w:tblCellMar>
-        </w:tblPrEx>
         <w:tc>
           <w:tcPr>
             <w:tcW w:w="2200" w:type="dxa"/>
@@ -4369,12 +4508,6 @@
         </w:tc>
       </w:tr>
       <w:tr>
-        <w:tblPrEx>
-          <w:tblCellMar>
-            <w:top w:w="0" w:type="dxa"/>
-            <w:bottom w:w="0" w:type="dxa"/>
-          </w:tblCellMar>
-        </w:tblPrEx>
         <w:tc>
           <w:tcPr>
             <w:tcW w:w="2200" w:type="dxa"/>
@@ -4432,12 +4565,6 @@
         </w:tc>
       </w:tr>
       <w:tr>
-        <w:tblPrEx>
-          <w:tblCellMar>
-            <w:top w:w="0" w:type="dxa"/>
-            <w:bottom w:w="0" w:type="dxa"/>
-          </w:tblCellMar>
-        </w:tblPrEx>
         <w:tc>
           <w:tcPr>
             <w:tcW w:w="2200" w:type="dxa"/>
@@ -4495,12 +4622,6 @@
         </w:tc>
       </w:tr>
       <w:tr>
-        <w:tblPrEx>
-          <w:tblCellMar>
-            <w:top w:w="0" w:type="dxa"/>
-            <w:bottom w:w="0" w:type="dxa"/>
-          </w:tblCellMar>
-        </w:tblPrEx>
         <w:tc>
           <w:tcPr>
             <w:tcW w:w="2200" w:type="dxa"/>
@@ -4558,12 +4679,6 @@
         </w:tc>
       </w:tr>
       <w:tr>
-        <w:tblPrEx>
-          <w:tblCellMar>
-            <w:top w:w="0" w:type="dxa"/>
-            <w:bottom w:w="0" w:type="dxa"/>
-          </w:tblCellMar>
-        </w:tblPrEx>
         <w:tc>
           <w:tcPr>
             <w:tcW w:w="2200" w:type="dxa"/>
@@ -4654,12 +4769,6 @@
         <w:gridCol w:w="6826"/>
       </w:tblGrid>
       <w:tr>
-        <w:tblPrEx>
-          <w:tblCellMar>
-            <w:top w:w="0" w:type="dxa"/>
-            <w:bottom w:w="0" w:type="dxa"/>
-          </w:tblCellMar>
-        </w:tblPrEx>
         <w:tc>
           <w:tcPr>
             <w:tcW w:w="2200" w:type="dxa"/>
@@ -4717,12 +4826,6 @@
         </w:tc>
       </w:tr>
       <w:tr>
-        <w:tblPrEx>
-          <w:tblCellMar>
-            <w:top w:w="0" w:type="dxa"/>
-            <w:bottom w:w="0" w:type="dxa"/>
-          </w:tblCellMar>
-        </w:tblPrEx>
         <w:tc>
           <w:tcPr>
             <w:tcW w:w="2200" w:type="dxa"/>
@@ -4780,12 +4883,6 @@
         </w:tc>
       </w:tr>
       <w:tr>
-        <w:tblPrEx>
-          <w:tblCellMar>
-            <w:top w:w="0" w:type="dxa"/>
-            <w:bottom w:w="0" w:type="dxa"/>
-          </w:tblCellMar>
-        </w:tblPrEx>
         <w:tc>
           <w:tcPr>
             <w:tcW w:w="2200" w:type="dxa"/>
@@ -4843,12 +4940,6 @@
         </w:tc>
       </w:tr>
       <w:tr>
-        <w:tblPrEx>
-          <w:tblCellMar>
-            <w:top w:w="0" w:type="dxa"/>
-            <w:bottom w:w="0" w:type="dxa"/>
-          </w:tblCellMar>
-        </w:tblPrEx>
         <w:tc>
           <w:tcPr>
             <w:tcW w:w="2200" w:type="dxa"/>
@@ -4906,12 +4997,6 @@
         </w:tc>
       </w:tr>
       <w:tr>
-        <w:tblPrEx>
-          <w:tblCellMar>
-            <w:top w:w="0" w:type="dxa"/>
-            <w:bottom w:w="0" w:type="dxa"/>
-          </w:tblCellMar>
-        </w:tblPrEx>
         <w:tc>
           <w:tcPr>
             <w:tcW w:w="2200" w:type="dxa"/>
@@ -4969,12 +5054,6 @@
         </w:tc>
       </w:tr>
       <w:tr>
-        <w:tblPrEx>
-          <w:tblCellMar>
-            <w:top w:w="0" w:type="dxa"/>
-            <w:bottom w:w="0" w:type="dxa"/>
-          </w:tblCellMar>
-        </w:tblPrEx>
         <w:tc>
           <w:tcPr>
             <w:tcW w:w="2200" w:type="dxa"/>
@@ -5000,6 +5079,7 @@
                 <w:sz w:val="20"/>
                 <w:szCs w:val="20"/>
               </w:rPr>
+              <w:lastRenderedPageBreak/>
               <w:t>Postconditions</w:t>
             </w:r>
           </w:p>
@@ -5032,12 +5112,6 @@
         </w:tc>
       </w:tr>
       <w:tr>
-        <w:tblPrEx>
-          <w:tblCellMar>
-            <w:top w:w="0" w:type="dxa"/>
-            <w:bottom w:w="0" w:type="dxa"/>
-          </w:tblCellMar>
-        </w:tblPrEx>
         <w:tc>
           <w:tcPr>
             <w:tcW w:w="2200" w:type="dxa"/>
@@ -5095,12 +5169,6 @@
         </w:tc>
       </w:tr>
       <w:tr>
-        <w:tblPrEx>
-          <w:tblCellMar>
-            <w:top w:w="0" w:type="dxa"/>
-            <w:bottom w:w="0" w:type="dxa"/>
-          </w:tblCellMar>
-        </w:tblPrEx>
         <w:tc>
           <w:tcPr>
             <w:tcW w:w="2200" w:type="dxa"/>
@@ -5158,12 +5226,6 @@
         </w:tc>
       </w:tr>
       <w:tr>
-        <w:tblPrEx>
-          <w:tblCellMar>
-            <w:top w:w="0" w:type="dxa"/>
-            <w:bottom w:w="0" w:type="dxa"/>
-          </w:tblCellMar>
-        </w:tblPrEx>
         <w:tc>
           <w:tcPr>
             <w:tcW w:w="2200" w:type="dxa"/>
@@ -5308,12 +5370,6 @@
         <w:gridCol w:w="4926"/>
       </w:tblGrid>
       <w:tr>
-        <w:tblPrEx>
-          <w:tblCellMar>
-            <w:top w:w="0" w:type="dxa"/>
-            <w:bottom w:w="0" w:type="dxa"/>
-          </w:tblCellMar>
-        </w:tblPrEx>
         <w:tc>
           <w:tcPr>
             <w:tcW w:w="2000" w:type="dxa"/>
@@ -5470,12 +5526,6 @@
         <w:gridCol w:w="4926"/>
       </w:tblGrid>
       <w:tr>
-        <w:tblPrEx>
-          <w:tblCellMar>
-            <w:top w:w="0" w:type="dxa"/>
-            <w:bottom w:w="0" w:type="dxa"/>
-          </w:tblCellMar>
-        </w:tblPrEx>
         <w:tc>
           <w:tcPr>
             <w:tcW w:w="2000" w:type="dxa"/>
@@ -5598,12 +5648,6 @@
         </w:tc>
       </w:tr>
       <w:tr>
-        <w:tblPrEx>
-          <w:tblCellMar>
-            <w:top w:w="0" w:type="dxa"/>
-            <w:bottom w:w="0" w:type="dxa"/>
-          </w:tblCellMar>
-        </w:tblPrEx>
         <w:tc>
           <w:tcPr>
             <w:tcW w:w="2000" w:type="dxa"/>
@@ -5718,12 +5762,6 @@
         </w:tc>
       </w:tr>
       <w:tr>
-        <w:tblPrEx>
-          <w:tblCellMar>
-            <w:top w:w="0" w:type="dxa"/>
-            <w:bottom w:w="0" w:type="dxa"/>
-          </w:tblCellMar>
-        </w:tblPrEx>
         <w:tc>
           <w:tcPr>
             <w:tcW w:w="2000" w:type="dxa"/>
@@ -5838,12 +5876,6 @@
         </w:tc>
       </w:tr>
       <w:tr>
-        <w:tblPrEx>
-          <w:tblCellMar>
-            <w:top w:w="0" w:type="dxa"/>
-            <w:bottom w:w="0" w:type="dxa"/>
-          </w:tblCellMar>
-        </w:tblPrEx>
         <w:tc>
           <w:tcPr>
             <w:tcW w:w="2000" w:type="dxa"/>
@@ -5992,12 +6024,6 @@
         <w:gridCol w:w="4926"/>
       </w:tblGrid>
       <w:tr>
-        <w:tblPrEx>
-          <w:tblCellMar>
-            <w:top w:w="0" w:type="dxa"/>
-            <w:bottom w:w="0" w:type="dxa"/>
-          </w:tblCellMar>
-        </w:tblPrEx>
         <w:tc>
           <w:tcPr>
             <w:tcW w:w="2000" w:type="dxa"/>
@@ -6120,12 +6146,6 @@
         </w:tc>
       </w:tr>
       <w:tr>
-        <w:tblPrEx>
-          <w:tblCellMar>
-            <w:top w:w="0" w:type="dxa"/>
-            <w:bottom w:w="0" w:type="dxa"/>
-          </w:tblCellMar>
-        </w:tblPrEx>
         <w:tc>
           <w:tcPr>
             <w:tcW w:w="2000" w:type="dxa"/>
@@ -6240,12 +6260,6 @@
         </w:tc>
       </w:tr>
       <w:tr>
-        <w:tblPrEx>
-          <w:tblCellMar>
-            <w:top w:w="0" w:type="dxa"/>
-            <w:bottom w:w="0" w:type="dxa"/>
-          </w:tblCellMar>
-        </w:tblPrEx>
         <w:tc>
           <w:tcPr>
             <w:tcW w:w="2000" w:type="dxa"/>
@@ -6360,12 +6374,6 @@
         </w:tc>
       </w:tr>
       <w:tr>
-        <w:tblPrEx>
-          <w:tblCellMar>
-            <w:top w:w="0" w:type="dxa"/>
-            <w:bottom w:w="0" w:type="dxa"/>
-          </w:tblCellMar>
-        </w:tblPrEx>
         <w:tc>
           <w:tcPr>
             <w:tcW w:w="2000" w:type="dxa"/>
@@ -6480,12 +6488,6 @@
         </w:tc>
       </w:tr>
       <w:tr>
-        <w:tblPrEx>
-          <w:tblCellMar>
-            <w:top w:w="0" w:type="dxa"/>
-            <w:bottom w:w="0" w:type="dxa"/>
-          </w:tblCellMar>
-        </w:tblPrEx>
         <w:tc>
           <w:tcPr>
             <w:tcW w:w="2000" w:type="dxa"/>
@@ -6600,12 +6602,6 @@
         </w:tc>
       </w:tr>
       <w:tr>
-        <w:tblPrEx>
-          <w:tblCellMar>
-            <w:top w:w="0" w:type="dxa"/>
-            <w:bottom w:w="0" w:type="dxa"/>
-          </w:tblCellMar>
-        </w:tblPrEx>
         <w:tc>
           <w:tcPr>
             <w:tcW w:w="2000" w:type="dxa"/>
@@ -6754,12 +6750,6 @@
         <w:gridCol w:w="4926"/>
       </w:tblGrid>
       <w:tr>
-        <w:tblPrEx>
-          <w:tblCellMar>
-            <w:top w:w="0" w:type="dxa"/>
-            <w:bottom w:w="0" w:type="dxa"/>
-          </w:tblCellMar>
-        </w:tblPrEx>
         <w:tc>
           <w:tcPr>
             <w:tcW w:w="2000" w:type="dxa"/>
@@ -6882,12 +6872,6 @@
         </w:tc>
       </w:tr>
       <w:tr>
-        <w:tblPrEx>
-          <w:tblCellMar>
-            <w:top w:w="0" w:type="dxa"/>
-            <w:bottom w:w="0" w:type="dxa"/>
-          </w:tblCellMar>
-        </w:tblPrEx>
         <w:tc>
           <w:tcPr>
             <w:tcW w:w="2000" w:type="dxa"/>
@@ -7002,12 +6986,6 @@
         </w:tc>
       </w:tr>
       <w:tr>
-        <w:tblPrEx>
-          <w:tblCellMar>
-            <w:top w:w="0" w:type="dxa"/>
-            <w:bottom w:w="0" w:type="dxa"/>
-          </w:tblCellMar>
-        </w:tblPrEx>
         <w:tc>
           <w:tcPr>
             <w:tcW w:w="2000" w:type="dxa"/>
@@ -7122,12 +7100,6 @@
         </w:tc>
       </w:tr>
       <w:tr>
-        <w:tblPrEx>
-          <w:tblCellMar>
-            <w:top w:w="0" w:type="dxa"/>
-            <w:bottom w:w="0" w:type="dxa"/>
-          </w:tblCellMar>
-        </w:tblPrEx>
         <w:tc>
           <w:tcPr>
             <w:tcW w:w="2000" w:type="dxa"/>
@@ -7242,12 +7214,6 @@
         </w:tc>
       </w:tr>
       <w:tr>
-        <w:tblPrEx>
-          <w:tblCellMar>
-            <w:top w:w="0" w:type="dxa"/>
-            <w:bottom w:w="0" w:type="dxa"/>
-          </w:tblCellMar>
-        </w:tblPrEx>
         <w:tc>
           <w:tcPr>
             <w:tcW w:w="2000" w:type="dxa"/>
@@ -7396,12 +7362,6 @@
         <w:gridCol w:w="4926"/>
       </w:tblGrid>
       <w:tr>
-        <w:tblPrEx>
-          <w:tblCellMar>
-            <w:top w:w="0" w:type="dxa"/>
-            <w:bottom w:w="0" w:type="dxa"/>
-          </w:tblCellMar>
-        </w:tblPrEx>
         <w:tc>
           <w:tcPr>
             <w:tcW w:w="2000" w:type="dxa"/>
@@ -7524,12 +7484,6 @@
         </w:tc>
       </w:tr>
       <w:tr>
-        <w:tblPrEx>
-          <w:tblCellMar>
-            <w:top w:w="0" w:type="dxa"/>
-            <w:bottom w:w="0" w:type="dxa"/>
-          </w:tblCellMar>
-        </w:tblPrEx>
         <w:tc>
           <w:tcPr>
             <w:tcW w:w="2000" w:type="dxa"/>
@@ -7554,6 +7508,7 @@
                 <w:sz w:val="18"/>
                 <w:szCs w:val="18"/>
               </w:rPr>
+              <w:lastRenderedPageBreak/>
               <w:t>CusId</w:t>
             </w:r>
           </w:p>
@@ -7644,12 +7599,6 @@
         </w:tc>
       </w:tr>
       <w:tr>
-        <w:tblPrEx>
-          <w:tblCellMar>
-            <w:top w:w="0" w:type="dxa"/>
-            <w:bottom w:w="0" w:type="dxa"/>
-          </w:tblCellMar>
-        </w:tblPrEx>
         <w:tc>
           <w:tcPr>
             <w:tcW w:w="2000" w:type="dxa"/>
@@ -7764,12 +7713,6 @@
         </w:tc>
       </w:tr>
       <w:tr>
-        <w:tblPrEx>
-          <w:tblCellMar>
-            <w:top w:w="0" w:type="dxa"/>
-            <w:bottom w:w="0" w:type="dxa"/>
-          </w:tblCellMar>
-        </w:tblPrEx>
         <w:tc>
           <w:tcPr>
             <w:tcW w:w="2000" w:type="dxa"/>
@@ -7884,12 +7827,6 @@
         </w:tc>
       </w:tr>
       <w:tr>
-        <w:tblPrEx>
-          <w:tblCellMar>
-            <w:top w:w="0" w:type="dxa"/>
-            <w:bottom w:w="0" w:type="dxa"/>
-          </w:tblCellMar>
-        </w:tblPrEx>
         <w:tc>
           <w:tcPr>
             <w:tcW w:w="2000" w:type="dxa"/>
@@ -8004,12 +7941,6 @@
         </w:tc>
       </w:tr>
       <w:tr>
-        <w:tblPrEx>
-          <w:tblCellMar>
-            <w:top w:w="0" w:type="dxa"/>
-            <w:bottom w:w="0" w:type="dxa"/>
-          </w:tblCellMar>
-        </w:tblPrEx>
         <w:tc>
           <w:tcPr>
             <w:tcW w:w="2000" w:type="dxa"/>
@@ -8158,12 +8089,6 @@
         <w:gridCol w:w="4926"/>
       </w:tblGrid>
       <w:tr>
-        <w:tblPrEx>
-          <w:tblCellMar>
-            <w:top w:w="0" w:type="dxa"/>
-            <w:bottom w:w="0" w:type="dxa"/>
-          </w:tblCellMar>
-        </w:tblPrEx>
         <w:tc>
           <w:tcPr>
             <w:tcW w:w="2000" w:type="dxa"/>
@@ -8286,12 +8211,6 @@
         </w:tc>
       </w:tr>
       <w:tr>
-        <w:tblPrEx>
-          <w:tblCellMar>
-            <w:top w:w="0" w:type="dxa"/>
-            <w:bottom w:w="0" w:type="dxa"/>
-          </w:tblCellMar>
-        </w:tblPrEx>
         <w:tc>
           <w:tcPr>
             <w:tcW w:w="2000" w:type="dxa"/>
@@ -8406,12 +8325,6 @@
         </w:tc>
       </w:tr>
       <w:tr>
-        <w:tblPrEx>
-          <w:tblCellMar>
-            <w:top w:w="0" w:type="dxa"/>
-            <w:bottom w:w="0" w:type="dxa"/>
-          </w:tblCellMar>
-        </w:tblPrEx>
         <w:tc>
           <w:tcPr>
             <w:tcW w:w="2000" w:type="dxa"/>
@@ -8526,12 +8439,6 @@
         </w:tc>
       </w:tr>
       <w:tr>
-        <w:tblPrEx>
-          <w:tblCellMar>
-            <w:top w:w="0" w:type="dxa"/>
-            <w:bottom w:w="0" w:type="dxa"/>
-          </w:tblCellMar>
-        </w:tblPrEx>
         <w:tc>
           <w:tcPr>
             <w:tcW w:w="2000" w:type="dxa"/>
@@ -8646,12 +8553,6 @@
         </w:tc>
       </w:tr>
       <w:tr>
-        <w:tblPrEx>
-          <w:tblCellMar>
-            <w:top w:w="0" w:type="dxa"/>
-            <w:bottom w:w="0" w:type="dxa"/>
-          </w:tblCellMar>
-        </w:tblPrEx>
         <w:tc>
           <w:tcPr>
             <w:tcW w:w="2000" w:type="dxa"/>
@@ -8766,12 +8667,6 @@
         </w:tc>
       </w:tr>
       <w:tr>
-        <w:tblPrEx>
-          <w:tblCellMar>
-            <w:top w:w="0" w:type="dxa"/>
-            <w:bottom w:w="0" w:type="dxa"/>
-          </w:tblCellMar>
-        </w:tblPrEx>
         <w:tc>
           <w:tcPr>
             <w:tcW w:w="2000" w:type="dxa"/>
@@ -8886,12 +8781,6 @@
         </w:tc>
       </w:tr>
       <w:tr>
-        <w:tblPrEx>
-          <w:tblCellMar>
-            <w:top w:w="0" w:type="dxa"/>
-            <w:bottom w:w="0" w:type="dxa"/>
-          </w:tblCellMar>
-        </w:tblPrEx>
         <w:tc>
           <w:tcPr>
             <w:tcW w:w="2000" w:type="dxa"/>
@@ -9006,12 +8895,6 @@
         </w:tc>
       </w:tr>
       <w:tr>
-        <w:tblPrEx>
-          <w:tblCellMar>
-            <w:top w:w="0" w:type="dxa"/>
-            <w:bottom w:w="0" w:type="dxa"/>
-          </w:tblCellMar>
-        </w:tblPrEx>
         <w:tc>
           <w:tcPr>
             <w:tcW w:w="2000" w:type="dxa"/>
@@ -9160,12 +9043,6 @@
         <w:gridCol w:w="4926"/>
       </w:tblGrid>
       <w:tr>
-        <w:tblPrEx>
-          <w:tblCellMar>
-            <w:top w:w="0" w:type="dxa"/>
-            <w:bottom w:w="0" w:type="dxa"/>
-          </w:tblCellMar>
-        </w:tblPrEx>
         <w:tc>
           <w:tcPr>
             <w:tcW w:w="2000" w:type="dxa"/>
@@ -9192,7 +9069,6 @@
                 <w:sz w:val="18"/>
                 <w:szCs w:val="18"/>
               </w:rPr>
-              <w:lastRenderedPageBreak/>
               <w:t>Attribute</w:t>
             </w:r>
           </w:p>
@@ -9289,12 +9165,6 @@
         </w:tc>
       </w:tr>
       <w:tr>
-        <w:tblPrEx>
-          <w:tblCellMar>
-            <w:top w:w="0" w:type="dxa"/>
-            <w:bottom w:w="0" w:type="dxa"/>
-          </w:tblCellMar>
-        </w:tblPrEx>
         <w:tc>
           <w:tcPr>
             <w:tcW w:w="2000" w:type="dxa"/>
@@ -9409,12 +9279,6 @@
         </w:tc>
       </w:tr>
       <w:tr>
-        <w:tblPrEx>
-          <w:tblCellMar>
-            <w:top w:w="0" w:type="dxa"/>
-            <w:bottom w:w="0" w:type="dxa"/>
-          </w:tblCellMar>
-        </w:tblPrEx>
         <w:tc>
           <w:tcPr>
             <w:tcW w:w="2000" w:type="dxa"/>
@@ -9529,12 +9393,6 @@
         </w:tc>
       </w:tr>
       <w:tr>
-        <w:tblPrEx>
-          <w:tblCellMar>
-            <w:top w:w="0" w:type="dxa"/>
-            <w:bottom w:w="0" w:type="dxa"/>
-          </w:tblCellMar>
-        </w:tblPrEx>
         <w:tc>
           <w:tcPr>
             <w:tcW w:w="2000" w:type="dxa"/>
@@ -9649,12 +9507,6 @@
         </w:tc>
       </w:tr>
       <w:tr>
-        <w:tblPrEx>
-          <w:tblCellMar>
-            <w:top w:w="0" w:type="dxa"/>
-            <w:bottom w:w="0" w:type="dxa"/>
-          </w:tblCellMar>
-        </w:tblPrEx>
         <w:tc>
           <w:tcPr>
             <w:tcW w:w="2000" w:type="dxa"/>
@@ -9769,12 +9621,6 @@
         </w:tc>
       </w:tr>
       <w:tr>
-        <w:tblPrEx>
-          <w:tblCellMar>
-            <w:top w:w="0" w:type="dxa"/>
-            <w:bottom w:w="0" w:type="dxa"/>
-          </w:tblCellMar>
-        </w:tblPrEx>
         <w:tc>
           <w:tcPr>
             <w:tcW w:w="2000" w:type="dxa"/>
@@ -9889,12 +9735,6 @@
         </w:tc>
       </w:tr>
       <w:tr>
-        <w:tblPrEx>
-          <w:tblCellMar>
-            <w:top w:w="0" w:type="dxa"/>
-            <w:bottom w:w="0" w:type="dxa"/>
-          </w:tblCellMar>
-        </w:tblPrEx>
         <w:tc>
           <w:tcPr>
             <w:tcW w:w="2000" w:type="dxa"/>
@@ -10009,12 +9849,6 @@
         </w:tc>
       </w:tr>
       <w:tr>
-        <w:tblPrEx>
-          <w:tblCellMar>
-            <w:top w:w="0" w:type="dxa"/>
-            <w:bottom w:w="0" w:type="dxa"/>
-          </w:tblCellMar>
-        </w:tblPrEx>
         <w:tc>
           <w:tcPr>
             <w:tcW w:w="2000" w:type="dxa"/>
@@ -10129,12 +9963,6 @@
         </w:tc>
       </w:tr>
       <w:tr>
-        <w:tblPrEx>
-          <w:tblCellMar>
-            <w:top w:w="0" w:type="dxa"/>
-            <w:bottom w:w="0" w:type="dxa"/>
-          </w:tblCellMar>
-        </w:tblPrEx>
         <w:tc>
           <w:tcPr>
             <w:tcW w:w="2000" w:type="dxa"/>
@@ -10249,12 +10077,6 @@
         </w:tc>
       </w:tr>
       <w:tr>
-        <w:tblPrEx>
-          <w:tblCellMar>
-            <w:top w:w="0" w:type="dxa"/>
-            <w:bottom w:w="0" w:type="dxa"/>
-          </w:tblCellMar>
-        </w:tblPrEx>
         <w:tc>
           <w:tcPr>
             <w:tcW w:w="2000" w:type="dxa"/>
@@ -10369,12 +10191,6 @@
         </w:tc>
       </w:tr>
       <w:tr>
-        <w:tblPrEx>
-          <w:tblCellMar>
-            <w:top w:w="0" w:type="dxa"/>
-            <w:bottom w:w="0" w:type="dxa"/>
-          </w:tblCellMar>
-        </w:tblPrEx>
         <w:tc>
           <w:tcPr>
             <w:tcW w:w="2000" w:type="dxa"/>
@@ -10523,12 +10339,6 @@
         <w:gridCol w:w="4926"/>
       </w:tblGrid>
       <w:tr>
-        <w:tblPrEx>
-          <w:tblCellMar>
-            <w:top w:w="0" w:type="dxa"/>
-            <w:bottom w:w="0" w:type="dxa"/>
-          </w:tblCellMar>
-        </w:tblPrEx>
         <w:tc>
           <w:tcPr>
             <w:tcW w:w="2000" w:type="dxa"/>
@@ -10651,12 +10461,6 @@
         </w:tc>
       </w:tr>
       <w:tr>
-        <w:tblPrEx>
-          <w:tblCellMar>
-            <w:top w:w="0" w:type="dxa"/>
-            <w:bottom w:w="0" w:type="dxa"/>
-          </w:tblCellMar>
-        </w:tblPrEx>
         <w:tc>
           <w:tcPr>
             <w:tcW w:w="2000" w:type="dxa"/>
@@ -10771,12 +10575,6 @@
         </w:tc>
       </w:tr>
       <w:tr>
-        <w:tblPrEx>
-          <w:tblCellMar>
-            <w:top w:w="0" w:type="dxa"/>
-            <w:bottom w:w="0" w:type="dxa"/>
-          </w:tblCellMar>
-        </w:tblPrEx>
         <w:tc>
           <w:tcPr>
             <w:tcW w:w="2000" w:type="dxa"/>
@@ -10891,12 +10689,6 @@
         </w:tc>
       </w:tr>
       <w:tr>
-        <w:tblPrEx>
-          <w:tblCellMar>
-            <w:top w:w="0" w:type="dxa"/>
-            <w:bottom w:w="0" w:type="dxa"/>
-          </w:tblCellMar>
-        </w:tblPrEx>
         <w:tc>
           <w:tcPr>
             <w:tcW w:w="2000" w:type="dxa"/>
@@ -11011,12 +10803,6 @@
         </w:tc>
       </w:tr>
       <w:tr>
-        <w:tblPrEx>
-          <w:tblCellMar>
-            <w:top w:w="0" w:type="dxa"/>
-            <w:bottom w:w="0" w:type="dxa"/>
-          </w:tblCellMar>
-        </w:tblPrEx>
         <w:tc>
           <w:tcPr>
             <w:tcW w:w="2000" w:type="dxa"/>
@@ -11131,12 +10917,6 @@
         </w:tc>
       </w:tr>
       <w:tr>
-        <w:tblPrEx>
-          <w:tblCellMar>
-            <w:top w:w="0" w:type="dxa"/>
-            <w:bottom w:w="0" w:type="dxa"/>
-          </w:tblCellMar>
-        </w:tblPrEx>
         <w:tc>
           <w:tcPr>
             <w:tcW w:w="2000" w:type="dxa"/>
@@ -11285,12 +11065,6 @@
         <w:gridCol w:w="4926"/>
       </w:tblGrid>
       <w:tr>
-        <w:tblPrEx>
-          <w:tblCellMar>
-            <w:top w:w="0" w:type="dxa"/>
-            <w:bottom w:w="0" w:type="dxa"/>
-          </w:tblCellMar>
-        </w:tblPrEx>
         <w:tc>
           <w:tcPr>
             <w:tcW w:w="2000" w:type="dxa"/>
@@ -11413,12 +11187,6 @@
         </w:tc>
       </w:tr>
       <w:tr>
-        <w:tblPrEx>
-          <w:tblCellMar>
-            <w:top w:w="0" w:type="dxa"/>
-            <w:bottom w:w="0" w:type="dxa"/>
-          </w:tblCellMar>
-        </w:tblPrEx>
         <w:tc>
           <w:tcPr>
             <w:tcW w:w="2000" w:type="dxa"/>
@@ -11533,12 +11301,6 @@
         </w:tc>
       </w:tr>
       <w:tr>
-        <w:tblPrEx>
-          <w:tblCellMar>
-            <w:top w:w="0" w:type="dxa"/>
-            <w:bottom w:w="0" w:type="dxa"/>
-          </w:tblCellMar>
-        </w:tblPrEx>
         <w:tc>
           <w:tcPr>
             <w:tcW w:w="2000" w:type="dxa"/>
@@ -11653,12 +11415,6 @@
         </w:tc>
       </w:tr>
       <w:tr>
-        <w:tblPrEx>
-          <w:tblCellMar>
-            <w:top w:w="0" w:type="dxa"/>
-            <w:bottom w:w="0" w:type="dxa"/>
-          </w:tblCellMar>
-        </w:tblPrEx>
         <w:tc>
           <w:tcPr>
             <w:tcW w:w="2000" w:type="dxa"/>
@@ -11773,12 +11529,6 @@
         </w:tc>
       </w:tr>
       <w:tr>
-        <w:tblPrEx>
-          <w:tblCellMar>
-            <w:top w:w="0" w:type="dxa"/>
-            <w:bottom w:w="0" w:type="dxa"/>
-          </w:tblCellMar>
-        </w:tblPrEx>
         <w:tc>
           <w:tcPr>
             <w:tcW w:w="2000" w:type="dxa"/>
@@ -11893,12 +11643,6 @@
         </w:tc>
       </w:tr>
       <w:tr>
-        <w:tblPrEx>
-          <w:tblCellMar>
-            <w:top w:w="0" w:type="dxa"/>
-            <w:bottom w:w="0" w:type="dxa"/>
-          </w:tblCellMar>
-        </w:tblPrEx>
         <w:tc>
           <w:tcPr>
             <w:tcW w:w="2000" w:type="dxa"/>
@@ -12013,12 +11757,6 @@
         </w:tc>
       </w:tr>
       <w:tr>
-        <w:tblPrEx>
-          <w:tblCellMar>
-            <w:top w:w="0" w:type="dxa"/>
-            <w:bottom w:w="0" w:type="dxa"/>
-          </w:tblCellMar>
-        </w:tblPrEx>
         <w:tc>
           <w:tcPr>
             <w:tcW w:w="2000" w:type="dxa"/>
@@ -12043,6 +11781,7 @@
                 <w:sz w:val="18"/>
                 <w:szCs w:val="18"/>
               </w:rPr>
+              <w:lastRenderedPageBreak/>
               <w:t>RemainingQuantity</w:t>
             </w:r>
           </w:p>
@@ -12133,12 +11872,6 @@
         </w:tc>
       </w:tr>
       <w:tr>
-        <w:tblPrEx>
-          <w:tblCellMar>
-            <w:top w:w="0" w:type="dxa"/>
-            <w:bottom w:w="0" w:type="dxa"/>
-          </w:tblCellMar>
-        </w:tblPrEx>
         <w:tc>
           <w:tcPr>
             <w:tcW w:w="2000" w:type="dxa"/>
@@ -12287,12 +12020,6 @@
         <w:gridCol w:w="4926"/>
       </w:tblGrid>
       <w:tr>
-        <w:tblPrEx>
-          <w:tblCellMar>
-            <w:top w:w="0" w:type="dxa"/>
-            <w:bottom w:w="0" w:type="dxa"/>
-          </w:tblCellMar>
-        </w:tblPrEx>
         <w:tc>
           <w:tcPr>
             <w:tcW w:w="2000" w:type="dxa"/>
@@ -12415,12 +12142,6 @@
         </w:tc>
       </w:tr>
       <w:tr>
-        <w:tblPrEx>
-          <w:tblCellMar>
-            <w:top w:w="0" w:type="dxa"/>
-            <w:bottom w:w="0" w:type="dxa"/>
-          </w:tblCellMar>
-        </w:tblPrEx>
         <w:tc>
           <w:tcPr>
             <w:tcW w:w="2000" w:type="dxa"/>
@@ -12535,12 +12256,6 @@
         </w:tc>
       </w:tr>
       <w:tr>
-        <w:tblPrEx>
-          <w:tblCellMar>
-            <w:top w:w="0" w:type="dxa"/>
-            <w:bottom w:w="0" w:type="dxa"/>
-          </w:tblCellMar>
-        </w:tblPrEx>
         <w:tc>
           <w:tcPr>
             <w:tcW w:w="2000" w:type="dxa"/>
@@ -12655,12 +12370,6 @@
         </w:tc>
       </w:tr>
       <w:tr>
-        <w:tblPrEx>
-          <w:tblCellMar>
-            <w:top w:w="0" w:type="dxa"/>
-            <w:bottom w:w="0" w:type="dxa"/>
-          </w:tblCellMar>
-        </w:tblPrEx>
         <w:tc>
           <w:tcPr>
             <w:tcW w:w="2000" w:type="dxa"/>
@@ -12775,12 +12484,6 @@
         </w:tc>
       </w:tr>
       <w:tr>
-        <w:tblPrEx>
-          <w:tblCellMar>
-            <w:top w:w="0" w:type="dxa"/>
-            <w:bottom w:w="0" w:type="dxa"/>
-          </w:tblCellMar>
-        </w:tblPrEx>
         <w:tc>
           <w:tcPr>
             <w:tcW w:w="2000" w:type="dxa"/>
@@ -12895,12 +12598,6 @@
         </w:tc>
       </w:tr>
       <w:tr>
-        <w:tblPrEx>
-          <w:tblCellMar>
-            <w:top w:w="0" w:type="dxa"/>
-            <w:bottom w:w="0" w:type="dxa"/>
-          </w:tblCellMar>
-        </w:tblPrEx>
         <w:tc>
           <w:tcPr>
             <w:tcW w:w="2000" w:type="dxa"/>
@@ -13049,12 +12746,6 @@
         <w:gridCol w:w="4926"/>
       </w:tblGrid>
       <w:tr>
-        <w:tblPrEx>
-          <w:tblCellMar>
-            <w:top w:w="0" w:type="dxa"/>
-            <w:bottom w:w="0" w:type="dxa"/>
-          </w:tblCellMar>
-        </w:tblPrEx>
         <w:tc>
           <w:tcPr>
             <w:tcW w:w="2000" w:type="dxa"/>
@@ -13177,12 +12868,6 @@
         </w:tc>
       </w:tr>
       <w:tr>
-        <w:tblPrEx>
-          <w:tblCellMar>
-            <w:top w:w="0" w:type="dxa"/>
-            <w:bottom w:w="0" w:type="dxa"/>
-          </w:tblCellMar>
-        </w:tblPrEx>
         <w:tc>
           <w:tcPr>
             <w:tcW w:w="2000" w:type="dxa"/>
@@ -13297,12 +12982,6 @@
         </w:tc>
       </w:tr>
       <w:tr>
-        <w:tblPrEx>
-          <w:tblCellMar>
-            <w:top w:w="0" w:type="dxa"/>
-            <w:bottom w:w="0" w:type="dxa"/>
-          </w:tblCellMar>
-        </w:tblPrEx>
         <w:tc>
           <w:tcPr>
             <w:tcW w:w="2000" w:type="dxa"/>
@@ -13417,12 +13096,6 @@
         </w:tc>
       </w:tr>
       <w:tr>
-        <w:tblPrEx>
-          <w:tblCellMar>
-            <w:top w:w="0" w:type="dxa"/>
-            <w:bottom w:w="0" w:type="dxa"/>
-          </w:tblCellMar>
-        </w:tblPrEx>
         <w:tc>
           <w:tcPr>
             <w:tcW w:w="2000" w:type="dxa"/>
@@ -13537,12 +13210,6 @@
         </w:tc>
       </w:tr>
       <w:tr>
-        <w:tblPrEx>
-          <w:tblCellMar>
-            <w:top w:w="0" w:type="dxa"/>
-            <w:bottom w:w="0" w:type="dxa"/>
-          </w:tblCellMar>
-        </w:tblPrEx>
         <w:tc>
           <w:tcPr>
             <w:tcW w:w="2000" w:type="dxa"/>
@@ -13657,12 +13324,6 @@
         </w:tc>
       </w:tr>
       <w:tr>
-        <w:tblPrEx>
-          <w:tblCellMar>
-            <w:top w:w="0" w:type="dxa"/>
-            <w:bottom w:w="0" w:type="dxa"/>
-          </w:tblCellMar>
-        </w:tblPrEx>
         <w:tc>
           <w:tcPr>
             <w:tcW w:w="2000" w:type="dxa"/>
@@ -13687,7 +13348,6 @@
                 <w:sz w:val="18"/>
                 <w:szCs w:val="18"/>
               </w:rPr>
-              <w:lastRenderedPageBreak/>
               <w:t>UserType</w:t>
             </w:r>
           </w:p>
@@ -13812,12 +13472,6 @@
         <w:gridCol w:w="4926"/>
       </w:tblGrid>
       <w:tr>
-        <w:tblPrEx>
-          <w:tblCellMar>
-            <w:top w:w="0" w:type="dxa"/>
-            <w:bottom w:w="0" w:type="dxa"/>
-          </w:tblCellMar>
-        </w:tblPrEx>
         <w:tc>
           <w:tcPr>
             <w:tcW w:w="2000" w:type="dxa"/>
@@ -13940,12 +13594,6 @@
         </w:tc>
       </w:tr>
       <w:tr>
-        <w:tblPrEx>
-          <w:tblCellMar>
-            <w:top w:w="0" w:type="dxa"/>
-            <w:bottom w:w="0" w:type="dxa"/>
-          </w:tblCellMar>
-        </w:tblPrEx>
         <w:tc>
           <w:tcPr>
             <w:tcW w:w="2000" w:type="dxa"/>
@@ -14060,12 +13708,6 @@
         </w:tc>
       </w:tr>
       <w:tr>
-        <w:tblPrEx>
-          <w:tblCellMar>
-            <w:top w:w="0" w:type="dxa"/>
-            <w:bottom w:w="0" w:type="dxa"/>
-          </w:tblCellMar>
-        </w:tblPrEx>
         <w:tc>
           <w:tcPr>
             <w:tcW w:w="2000" w:type="dxa"/>
@@ -14180,12 +13822,6 @@
         </w:tc>
       </w:tr>
       <w:tr>
-        <w:tblPrEx>
-          <w:tblCellMar>
-            <w:top w:w="0" w:type="dxa"/>
-            <w:bottom w:w="0" w:type="dxa"/>
-          </w:tblCellMar>
-        </w:tblPrEx>
         <w:tc>
           <w:tcPr>
             <w:tcW w:w="2000" w:type="dxa"/>
@@ -14300,12 +13936,6 @@
         </w:tc>
       </w:tr>
       <w:tr>
-        <w:tblPrEx>
-          <w:tblCellMar>
-            <w:top w:w="0" w:type="dxa"/>
-            <w:bottom w:w="0" w:type="dxa"/>
-          </w:tblCellMar>
-        </w:tblPrEx>
         <w:tc>
           <w:tcPr>
             <w:tcW w:w="2000" w:type="dxa"/>
@@ -14420,12 +14050,6 @@
         </w:tc>
       </w:tr>
       <w:tr>
-        <w:tblPrEx>
-          <w:tblCellMar>
-            <w:top w:w="0" w:type="dxa"/>
-            <w:bottom w:w="0" w:type="dxa"/>
-          </w:tblCellMar>
-        </w:tblPrEx>
         <w:tc>
           <w:tcPr>
             <w:tcW w:w="2000" w:type="dxa"/>
@@ -14574,12 +14198,6 @@
         <w:gridCol w:w="4926"/>
       </w:tblGrid>
       <w:tr>
-        <w:tblPrEx>
-          <w:tblCellMar>
-            <w:top w:w="0" w:type="dxa"/>
-            <w:bottom w:w="0" w:type="dxa"/>
-          </w:tblCellMar>
-        </w:tblPrEx>
         <w:tc>
           <w:tcPr>
             <w:tcW w:w="2000" w:type="dxa"/>
@@ -14702,12 +14320,6 @@
         </w:tc>
       </w:tr>
       <w:tr>
-        <w:tblPrEx>
-          <w:tblCellMar>
-            <w:top w:w="0" w:type="dxa"/>
-            <w:bottom w:w="0" w:type="dxa"/>
-          </w:tblCellMar>
-        </w:tblPrEx>
         <w:tc>
           <w:tcPr>
             <w:tcW w:w="2000" w:type="dxa"/>
@@ -14822,12 +14434,6 @@
         </w:tc>
       </w:tr>
       <w:tr>
-        <w:tblPrEx>
-          <w:tblCellMar>
-            <w:top w:w="0" w:type="dxa"/>
-            <w:bottom w:w="0" w:type="dxa"/>
-          </w:tblCellMar>
-        </w:tblPrEx>
         <w:tc>
           <w:tcPr>
             <w:tcW w:w="2000" w:type="dxa"/>
@@ -14942,12 +14548,6 @@
         </w:tc>
       </w:tr>
       <w:tr>
-        <w:tblPrEx>
-          <w:tblCellMar>
-            <w:top w:w="0" w:type="dxa"/>
-            <w:bottom w:w="0" w:type="dxa"/>
-          </w:tblCellMar>
-        </w:tblPrEx>
         <w:tc>
           <w:tcPr>
             <w:tcW w:w="2000" w:type="dxa"/>
@@ -15062,12 +14662,6 @@
         </w:tc>
       </w:tr>
       <w:tr>
-        <w:tblPrEx>
-          <w:tblCellMar>
-            <w:top w:w="0" w:type="dxa"/>
-            <w:bottom w:w="0" w:type="dxa"/>
-          </w:tblCellMar>
-        </w:tblPrEx>
         <w:tc>
           <w:tcPr>
             <w:tcW w:w="2000" w:type="dxa"/>
@@ -15182,12 +14776,6 @@
         </w:tc>
       </w:tr>
       <w:tr>
-        <w:tblPrEx>
-          <w:tblCellMar>
-            <w:top w:w="0" w:type="dxa"/>
-            <w:bottom w:w="0" w:type="dxa"/>
-          </w:tblCellMar>
-        </w:tblPrEx>
         <w:tc>
           <w:tcPr>
             <w:tcW w:w="2000" w:type="dxa"/>
@@ -15302,12 +14890,6 @@
         </w:tc>
       </w:tr>
       <w:tr>
-        <w:tblPrEx>
-          <w:tblCellMar>
-            <w:top w:w="0" w:type="dxa"/>
-            <w:bottom w:w="0" w:type="dxa"/>
-          </w:tblCellMar>
-        </w:tblPrEx>
         <w:tc>
           <w:tcPr>
             <w:tcW w:w="2000" w:type="dxa"/>
@@ -15422,12 +15004,6 @@
         </w:tc>
       </w:tr>
       <w:tr>
-        <w:tblPrEx>
-          <w:tblCellMar>
-            <w:top w:w="0" w:type="dxa"/>
-            <w:bottom w:w="0" w:type="dxa"/>
-          </w:tblCellMar>
-        </w:tblPrEx>
         <w:tc>
           <w:tcPr>
             <w:tcW w:w="2000" w:type="dxa"/>
@@ -15897,12 +15473,6 @@
         <w:gridCol w:w="4642"/>
       </w:tblGrid>
       <w:tr>
-        <w:tblPrEx>
-          <w:tblCellMar>
-            <w:top w:w="0" w:type="dxa"/>
-            <w:bottom w:w="0" w:type="dxa"/>
-          </w:tblCellMar>
-        </w:tblPrEx>
         <w:tc>
           <w:tcPr>
             <w:tcW w:w="2500" w:type="dxa"/>
@@ -15995,12 +15565,6 @@
         </w:tc>
       </w:tr>
       <w:tr>
-        <w:tblPrEx>
-          <w:tblCellMar>
-            <w:top w:w="0" w:type="dxa"/>
-            <w:bottom w:w="0" w:type="dxa"/>
-          </w:tblCellMar>
-        </w:tblPrEx>
         <w:tc>
           <w:tcPr>
             <w:tcW w:w="2500" w:type="dxa"/>
@@ -16084,12 +15648,6 @@
         </w:tc>
       </w:tr>
       <w:tr>
-        <w:tblPrEx>
-          <w:tblCellMar>
-            <w:top w:w="0" w:type="dxa"/>
-            <w:bottom w:w="0" w:type="dxa"/>
-          </w:tblCellMar>
-        </w:tblPrEx>
         <w:tc>
           <w:tcPr>
             <w:tcW w:w="2500" w:type="dxa"/>
@@ -16173,12 +15731,6 @@
         </w:tc>
       </w:tr>
       <w:tr>
-        <w:tblPrEx>
-          <w:tblCellMar>
-            <w:top w:w="0" w:type="dxa"/>
-            <w:bottom w:w="0" w:type="dxa"/>
-          </w:tblCellMar>
-        </w:tblPrEx>
         <w:tc>
           <w:tcPr>
             <w:tcW w:w="2500" w:type="dxa"/>
@@ -16262,12 +15814,6 @@
         </w:tc>
       </w:tr>
       <w:tr>
-        <w:tblPrEx>
-          <w:tblCellMar>
-            <w:top w:w="0" w:type="dxa"/>
-            <w:bottom w:w="0" w:type="dxa"/>
-          </w:tblCellMar>
-        </w:tblPrEx>
         <w:tc>
           <w:tcPr>
             <w:tcW w:w="2500" w:type="dxa"/>
@@ -16351,12 +15897,6 @@
         </w:tc>
       </w:tr>
       <w:tr>
-        <w:tblPrEx>
-          <w:tblCellMar>
-            <w:top w:w="0" w:type="dxa"/>
-            <w:bottom w:w="0" w:type="dxa"/>
-          </w:tblCellMar>
-        </w:tblPrEx>
         <w:tc>
           <w:tcPr>
             <w:tcW w:w="2500" w:type="dxa"/>
@@ -16440,12 +15980,6 @@
         </w:tc>
       </w:tr>
       <w:tr>
-        <w:tblPrEx>
-          <w:tblCellMar>
-            <w:top w:w="0" w:type="dxa"/>
-            <w:bottom w:w="0" w:type="dxa"/>
-          </w:tblCellMar>
-        </w:tblPrEx>
         <w:tc>
           <w:tcPr>
             <w:tcW w:w="2500" w:type="dxa"/>
@@ -16530,12 +16064,6 @@
         </w:tc>
       </w:tr>
       <w:tr>
-        <w:tblPrEx>
-          <w:tblCellMar>
-            <w:top w:w="0" w:type="dxa"/>
-            <w:bottom w:w="0" w:type="dxa"/>
-          </w:tblCellMar>
-        </w:tblPrEx>
         <w:tc>
           <w:tcPr>
             <w:tcW w:w="2500" w:type="dxa"/>
@@ -16619,12 +16147,6 @@
         </w:tc>
       </w:tr>
       <w:tr>
-        <w:tblPrEx>
-          <w:tblCellMar>
-            <w:top w:w="0" w:type="dxa"/>
-            <w:bottom w:w="0" w:type="dxa"/>
-          </w:tblCellMar>
-        </w:tblPrEx>
         <w:tc>
           <w:tcPr>
             <w:tcW w:w="2500" w:type="dxa"/>
@@ -16708,12 +16230,6 @@
         </w:tc>
       </w:tr>
       <w:tr>
-        <w:tblPrEx>
-          <w:tblCellMar>
-            <w:top w:w="0" w:type="dxa"/>
-            <w:bottom w:w="0" w:type="dxa"/>
-          </w:tblCellMar>
-        </w:tblPrEx>
         <w:tc>
           <w:tcPr>
             <w:tcW w:w="2500" w:type="dxa"/>
@@ -16797,12 +16313,6 @@
         </w:tc>
       </w:tr>
       <w:tr>
-        <w:tblPrEx>
-          <w:tblCellMar>
-            <w:top w:w="0" w:type="dxa"/>
-            <w:bottom w:w="0" w:type="dxa"/>
-          </w:tblCellMar>
-        </w:tblPrEx>
         <w:tc>
           <w:tcPr>
             <w:tcW w:w="2500" w:type="dxa"/>
@@ -16886,12 +16396,6 @@
         </w:tc>
       </w:tr>
       <w:tr>
-        <w:tblPrEx>
-          <w:tblCellMar>
-            <w:top w:w="0" w:type="dxa"/>
-            <w:bottom w:w="0" w:type="dxa"/>
-          </w:tblCellMar>
-        </w:tblPrEx>
         <w:tc>
           <w:tcPr>
             <w:tcW w:w="2500" w:type="dxa"/>
@@ -18747,4 +18251,16 @@
     </a:ext>
   </a:extLst>
 </a:theme>
+</file>
+
+<file path=customXml/item1.xml><?xml version="1.0" encoding="utf-8"?>
+<b:Sources xmlns:b="http://schemas.openxmlformats.org/officeDocument/2006/bibliography" xmlns="http://schemas.openxmlformats.org/officeDocument/2006/bibliography" SelectedStyle="/APASixthEditionOfficeOnline.xsl" StyleName="APA" Version="6"/>
+</file>
+
+<file path=customXml/itemProps1.xml><?xml version="1.0" encoding="utf-8"?>
+<ds:datastoreItem xmlns:ds="http://schemas.openxmlformats.org/officeDocument/2006/customXml" ds:itemID="{61CD5363-B8CB-3344-830F-37B931FDC9F3}">
+  <ds:schemaRefs>
+    <ds:schemaRef ds:uri="http://schemas.openxmlformats.org/officeDocument/2006/bibliography"/>
+  </ds:schemaRefs>
+</ds:datastoreItem>
 </file>
</xml_diff>